<commit_message>
Consignment note: flatten letterhead to an image for cross-renderer fidelity
The letterhead banner was VML/AlternateContent, which only Word draws — in-browser
renderers (the app's Print/Save-as-PDF) showed it as a dark block or dropped it.
Replace it with a high-resolution flat PNG of the exact letterhead (waves band,
both IndianOil logos, dealer block, GSTIN) in the page header, so it renders
identically in Word AND in every browser's PDF.

- Header (header2.xml) now carries a full-width inline letterhead image; removed
  the 8 leading empty spacer paragraphs that existed only to clear the old
  floating VML banner (kept the goods table and all body content intact).
- Header offset set to 0 so the banner sits at the top edge.
- Verified via docx-preview render: pixel-matches the Word-exported PDF — full
  letterhead, bordered goods table, single A4 page.

Co-Authored-By: Claude Opus 4.8 <noreply@anthropic.com>
Claude-Session: https://claude.ai/code/session_01DudLGc9pCYCSxH8q197T59
</commit_message>
<xml_diff>
--- a/payments/consignment_template.docx
+++ b/payments/consignment_template.docx
@@ -2,62 +2,6 @@
 <file path=word/document.xml><?xml version="1.0" encoding="utf-8"?>
 <w:document xmlns:wpc="http://schemas.microsoft.com/office/word/2010/wordprocessingCanvas" xmlns:cx="http://schemas.microsoft.com/office/drawing/2014/chartex" xmlns:cx1="http://schemas.microsoft.com/office/drawing/2015/9/8/chartex" xmlns:cx2="http://schemas.microsoft.com/office/drawing/2015/10/21/chartex" xmlns:cx3="http://schemas.microsoft.com/office/drawing/2016/5/9/chartex" xmlns:cx4="http://schemas.microsoft.com/office/drawing/2016/5/10/chartex" xmlns:cx5="http://schemas.microsoft.com/office/drawing/2016/5/11/chartex" xmlns:cx6="http://schemas.microsoft.com/office/drawing/2016/5/12/chartex" xmlns:cx7="http://schemas.microsoft.com/office/drawing/2016/5/13/chartex" xmlns:cx8="http://schemas.microsoft.com/office/drawing/2016/5/14/chartex" xmlns:mc="http://schemas.openxmlformats.org/markup-compatibility/2006" xmlns:m="http://schemas.openxmlformats.org/officeDocument/2006/math" xmlns:aink="http://schemas.microsoft.com/office/drawing/2016/ink" xmlns:am3d="http://schemas.microsoft.com/office/drawing/2017/model3d" xmlns:oel="http://schemas.microsoft.com/office/2019/extlst" xmlns:r="http://schemas.openxmlformats.org/officeDocument/2006/relationships" xmlns:wp14="http://schemas.microsoft.com/office/word/2010/wordprocessingDrawing" xmlns:wp="http://schemas.openxmlformats.org/drawingml/2006/wordprocessingDrawing" xmlns:wpg="http://schemas.microsoft.com/office/word/2010/wordprocessingGroup" xmlns:wpi="http://schemas.microsoft.com/office/word/2010/wordprocessingInk" xmlns:wps="http://schemas.microsoft.com/office/word/2010/wordprocessingShape" xmlns:o="urn:schemas-microsoft-com:office:office" xmlns:v="urn:schemas-microsoft-com:vml" xmlns:w10="urn:schemas-microsoft-com:office:word" xmlns:w="http://schemas.openxmlformats.org/wordprocessingml/2006/main" xmlns:w14="http://schemas.microsoft.com/office/word/2010/wordml" xmlns:w15="http://schemas.microsoft.com/office/word/2012/wordml" xmlns:w16cex="http://schemas.microsoft.com/office/word/2018/wordml/cex" xmlns:w16cid="http://schemas.microsoft.com/office/word/2016/wordml/cid" xmlns:w16="http://schemas.microsoft.com/office/word/2018/wordml" xmlns:w16sdtdh="http://schemas.microsoft.com/office/word/2020/wordml/sdtdatahash" xmlns:w16sdtfl="http://schemas.microsoft.com/office/word/2024/wordml/sdtformatlock" xmlns:w16se="http://schemas.microsoft.com/office/word/2015/wordml/symex" xmlns:w16du="http://schemas.microsoft.com/office/word/2023/wordml/word16du" xmlns:wne="http://schemas.microsoft.com/office/word/2006/wordml" mc:Ignorable="w14 w15 w16se w16cid w16 w16cex w16sdtdh w16sdtfl w16du wp14">
   <w:body>
-    <w:p>
-      <w:pPr>
-        <w:rPr>
-          <w:lang w:val="en-US"/>
-        </w:rPr>
-      </w:pPr>
-    </w:p>
-    <w:p>
-      <w:pPr>
-        <w:rPr>
-          <w:lang w:val="en-US"/>
-        </w:rPr>
-      </w:pPr>
-    </w:p>
-    <w:p>
-      <w:pPr>
-        <w:rPr>
-          <w:lang w:val="en-US"/>
-        </w:rPr>
-      </w:pPr>
-    </w:p>
-    <w:p>
-      <w:pPr>
-        <w:rPr>
-          <w:lang w:val="en-US"/>
-        </w:rPr>
-      </w:pPr>
-    </w:p>
-    <w:p>
-      <w:pPr>
-        <w:rPr>
-          <w:lang w:val="en-US"/>
-        </w:rPr>
-      </w:pPr>
-    </w:p>
-    <w:p>
-      <w:pPr>
-        <w:rPr>
-          <w:lang w:val="en-US"/>
-        </w:rPr>
-      </w:pPr>
-    </w:p>
-    <w:p>
-      <w:pPr>
-        <w:rPr>
-          <w:lang w:val="en-US"/>
-        </w:rPr>
-      </w:pPr>
-    </w:p>
-    <w:p>
-      <w:pPr>
-        <w:rPr>
-          <w:lang w:val="en-US"/>
-        </w:rPr>
-      </w:pPr>
-    </w:p>
     <w:p>
       <w:pPr>
         <w:jc w:val="center"/>
@@ -948,7 +892,7 @@
       <w:headerReference w:type="first" r:id="rId10"/>
       <w:footerReference w:type="first" r:id="rId11"/>
       <w:pgSz w:w="11906" w:h="16838"/>
-      <w:pgMar w:top="720" w:right="720" w:bottom="720" w:left="720" w:header="737" w:footer="227" w:gutter="0"/>
+      <w:pgMar w:top="720" w:right="720" w:bottom="720" w:left="720" w:header="0" w:footer="227" w:gutter="0"/>
       <w:cols w:space="708"/>
       <w:docGrid w:linePitch="360"/>
     </w:sectPr>
@@ -1035,1169 +979,48 @@
 </file>
 
 <file path=word/header2.xml><?xml version="1.0" encoding="utf-8"?>
-<w:hdr xmlns:wpc="http://schemas.microsoft.com/office/word/2010/wordprocessingCanvas" xmlns:cx="http://schemas.microsoft.com/office/drawing/2014/chartex" xmlns:cx1="http://schemas.microsoft.com/office/drawing/2015/9/8/chartex" xmlns:cx2="http://schemas.microsoft.com/office/drawing/2015/10/21/chartex" xmlns:cx3="http://schemas.microsoft.com/office/drawing/2016/5/9/chartex" xmlns:cx4="http://schemas.microsoft.com/office/drawing/2016/5/10/chartex" xmlns:cx5="http://schemas.microsoft.com/office/drawing/2016/5/11/chartex" xmlns:cx6="http://schemas.microsoft.com/office/drawing/2016/5/12/chartex" xmlns:cx7="http://schemas.microsoft.com/office/drawing/2016/5/13/chartex" xmlns:cx8="http://schemas.microsoft.com/office/drawing/2016/5/14/chartex" xmlns:mc="http://schemas.openxmlformats.org/markup-compatibility/2006" xmlns:m="http://schemas.openxmlformats.org/officeDocument/2006/math" xmlns:aink="http://schemas.microsoft.com/office/drawing/2016/ink" xmlns:am3d="http://schemas.microsoft.com/office/drawing/2017/model3d" xmlns:oel="http://schemas.microsoft.com/office/2019/extlst" xmlns:r="http://schemas.openxmlformats.org/officeDocument/2006/relationships" xmlns:wp14="http://schemas.microsoft.com/office/word/2010/wordprocessingDrawing" xmlns:wp="http://schemas.openxmlformats.org/drawingml/2006/wordprocessingDrawing" xmlns:wpg="http://schemas.microsoft.com/office/word/2010/wordprocessingGroup" xmlns:wpi="http://schemas.microsoft.com/office/word/2010/wordprocessingInk" xmlns:wps="http://schemas.microsoft.com/office/word/2010/wordprocessingShape" xmlns:o="urn:schemas-microsoft-com:office:office" xmlns:v="urn:schemas-microsoft-com:vml" xmlns:w10="urn:schemas-microsoft-com:office:word" xmlns:w="http://schemas.openxmlformats.org/wordprocessingml/2006/main" xmlns:w14="http://schemas.microsoft.com/office/word/2010/wordml" xmlns:w15="http://schemas.microsoft.com/office/word/2012/wordml" xmlns:w16cex="http://schemas.microsoft.com/office/word/2018/wordml/cex" xmlns:w16cid="http://schemas.microsoft.com/office/word/2016/wordml/cid" xmlns:w16="http://schemas.microsoft.com/office/word/2018/wordml" xmlns:w16sdtdh="http://schemas.microsoft.com/office/word/2020/wordml/sdtdatahash" xmlns:w16sdtfl="http://schemas.microsoft.com/office/word/2024/wordml/sdtformatlock" xmlns:w16se="http://schemas.microsoft.com/office/word/2015/wordml/symex" xmlns:w16du="http://schemas.microsoft.com/office/word/2023/wordml/word16du" xmlns:wne="http://schemas.microsoft.com/office/word/2006/wordml" mc:Ignorable="w14 w15 w16se w16cid w16 w16cex w16sdtdh w16sdtfl w16du wp14">
+<w:hdr xmlns:mc="http://schemas.openxmlformats.org/markup-compatibility/2006" xmlns:o="urn:schemas-microsoft-com:office:office" xmlns:r="http://schemas.openxmlformats.org/officeDocument/2006/relationships" xmlns:v="urn:schemas-microsoft-com:vml" xmlns:wp="http://schemas.openxmlformats.org/drawingml/2006/wordprocessingDrawing" xmlns:w10="urn:schemas-microsoft-com:office:word" xmlns:w="http://schemas.openxmlformats.org/wordprocessingml/2006/main" xmlns:a="http://schemas.openxmlformats.org/drawingml/2006/main" xmlns:pic="http://schemas.openxmlformats.org/drawingml/2006/picture">
   <w:p>
     <w:pPr>
-      <w:pStyle w:val="Header"/>
+      <w:spacing w:before="0" w:after="0" w:line="240" w:lineRule="auto"/>
+      <w:ind w:left="-737" w:right="-737"/>
     </w:pPr>
     <w:r>
-      <w:rPr>
-        <w:rFonts w:ascii="Times New Roman" w:eastAsia="Times New Roman" w:hAnsi="Times New Roman" w:cs="Times New Roman"/>
-        <w:noProof/>
-        <w:lang w:eastAsia="en-GB"/>
-      </w:rPr>
-      <mc:AlternateContent>
-        <mc:Choice Requires="wps">
-          <w:drawing>
-            <wp:anchor distT="0" distB="0" distL="114300" distR="114300" simplePos="0" relativeHeight="251664384" behindDoc="0" locked="0" layoutInCell="1" allowOverlap="1" wp14:anchorId="09DE56A8" wp14:editId="329FD48A">
-              <wp:simplePos x="0" y="0"/>
-              <wp:positionH relativeFrom="column">
-                <wp:posOffset>-594360</wp:posOffset>
-              </wp:positionH>
-              <wp:positionV relativeFrom="paragraph">
-                <wp:posOffset>-585648</wp:posOffset>
-              </wp:positionV>
-              <wp:extent cx="7758023" cy="477328"/>
-              <wp:effectExtent l="0" t="0" r="1905" b="5715"/>
-              <wp:wrapNone/>
-              <wp:docPr id="986537369" name="Wave 10"/>
-              <wp:cNvGraphicFramePr/>
-              <a:graphic xmlns:a="http://schemas.openxmlformats.org/drawingml/2006/main">
-                <a:graphicData uri="http://schemas.microsoft.com/office/word/2010/wordprocessingShape">
-                  <wps:wsp>
-                    <wps:cNvSpPr/>
-                    <wps:spPr>
-                      <a:xfrm>
-                        <a:off x="0" y="0"/>
-                        <a:ext cx="7758023" cy="477328"/>
-                      </a:xfrm>
-                      <a:prstGeom prst="wave">
-                        <a:avLst/>
-                      </a:prstGeom>
-                      <a:solidFill>
-                        <a:srgbClr val="F37022"/>
-                      </a:solidFill>
-                      <a:ln>
-                        <a:noFill/>
-                      </a:ln>
-                    </wps:spPr>
-                    <wps:style>
-                      <a:lnRef idx="0">
-                        <a:scrgbClr r="0" g="0" b="0"/>
-                      </a:lnRef>
-                      <a:fillRef idx="0">
-                        <a:scrgbClr r="0" g="0" b="0"/>
-                      </a:fillRef>
-                      <a:effectRef idx="0">
-                        <a:scrgbClr r="0" g="0" b="0"/>
-                      </a:effectRef>
-                      <a:fontRef idx="minor">
-                        <a:schemeClr val="dk1"/>
-                      </a:fontRef>
-                    </wps:style>
-                    <wps:bodyPr rot="0" spcFirstLastPara="0" vertOverflow="overflow" horzOverflow="overflow" vert="horz" wrap="square" lIns="91440" tIns="45720" rIns="91440" bIns="45720" numCol="1" spcCol="0" rtlCol="0" fromWordArt="0" anchor="ctr" anchorCtr="0" forceAA="0" compatLnSpc="1">
-                      <a:prstTxWarp prst="textNoShape">
-                        <a:avLst/>
-                      </a:prstTxWarp>
-                      <a:noAutofit/>
-                    </wps:bodyPr>
-                  </wps:wsp>
-                </a:graphicData>
-              </a:graphic>
-              <wp14:sizeRelH relativeFrom="margin">
-                <wp14:pctWidth>0</wp14:pctWidth>
-              </wp14:sizeRelH>
-              <wp14:sizeRelV relativeFrom="margin">
-                <wp14:pctHeight>0</wp14:pctHeight>
-              </wp14:sizeRelV>
-            </wp:anchor>
-          </w:drawing>
-        </mc:Choice>
-        <mc:Fallback xmlns:w16cei="http://schemas.microsoft.com/office/word/2026/wordml/cei">
-          <w:pict>
-            <v:shapetype w14:anchorId="6D2F3891" id="_x0000_t64" coordsize="21600,21600" o:spt="64" adj="2809,10800" path="m@28@0c@27@1@26@3@25@0l@21@4c@22@5@23@6@24@4xe">
-              <v:formulas>
-                <v:f eqn="val #0"/>
-                <v:f eqn="prod @0 41 9"/>
-                <v:f eqn="prod @0 23 9"/>
-                <v:f eqn="sum 0 0 @2"/>
-                <v:f eqn="sum 21600 0 #0"/>
-                <v:f eqn="sum 21600 0 @1"/>
-                <v:f eqn="sum 21600 0 @3"/>
-                <v:f eqn="sum #1 0 10800"/>
-                <v:f eqn="sum 21600 0 #1"/>
-                <v:f eqn="prod @8 2 3"/>
-                <v:f eqn="prod @8 4 3"/>
-                <v:f eqn="prod @8 2 1"/>
-                <v:f eqn="sum 21600 0 @9"/>
-                <v:f eqn="sum 21600 0 @10"/>
-                <v:f eqn="sum 21600 0 @11"/>
-                <v:f eqn="prod #1 2 3"/>
-                <v:f eqn="prod #1 4 3"/>
-                <v:f eqn="prod #1 2 1"/>
-                <v:f eqn="sum 21600 0 @15"/>
-                <v:f eqn="sum 21600 0 @16"/>
-                <v:f eqn="sum 21600 0 @17"/>
-                <v:f eqn="if @7 @14 0"/>
-                <v:f eqn="if @7 @13 @15"/>
-                <v:f eqn="if @7 @12 @16"/>
-                <v:f eqn="if @7 21600 @17"/>
-                <v:f eqn="if @7 0 @20"/>
-                <v:f eqn="if @7 @9 @19"/>
-                <v:f eqn="if @7 @10 @18"/>
-                <v:f eqn="if @7 @11 21600"/>
-                <v:f eqn="sum @24 0 @21"/>
-                <v:f eqn="sum @4 0 @0"/>
-                <v:f eqn="max @21 @25"/>
-                <v:f eqn="min @24 @28"/>
-                <v:f eqn="prod @0 2 1"/>
-                <v:f eqn="sum 21600 0 @33"/>
-                <v:f eqn="mid @26 @27"/>
-                <v:f eqn="mid @24 @28"/>
-                <v:f eqn="mid @22 @23"/>
-                <v:f eqn="mid @21 @25"/>
-              </v:formulas>
-              <v:path o:connecttype="custom" o:connectlocs="@35,@0;@38,10800;@37,@4;@36,10800" o:connectangles="270,180,90,0" textboxrect="@31,@33,@32,@34"/>
-              <v:handles>
-                <v:h position="topLeft,#0" yrange="0,4459"/>
-                <v:h position="#1,bottomRight" xrange="8640,12960"/>
-              </v:handles>
-            </v:shapetype>
-            <v:shape id="Wave 10" o:spid="_x0000_s1026" type="#_x0000_t64" style="position:absolute;margin-left:-46.8pt;margin-top:-46.1pt;width:610.85pt;height:37.6pt;z-index:251664384;visibility:visible;mso-wrap-style:square;mso-width-percent:0;mso-height-percent:0;mso-wrap-distance-left:9pt;mso-wrap-distance-top:0;mso-wrap-distance-right:9pt;mso-wrap-distance-bottom:0;mso-position-horizontal:absolute;mso-position-horizontal-relative:text;mso-position-vertical:absolute;mso-position-vertical-relative:text;mso-width-percent:0;mso-height-percent:0;mso-width-relative:margin;mso-height-relative:margin;v-text-anchor:middle" o:gfxdata="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" adj="2700" fillcolor="#f37022" stroked="f"/>
-          </w:pict>
-        </mc:Fallback>
-      </mc:AlternateContent>
-    </w:r>
-    <w:r>
-      <w:rPr>
-        <w:rFonts w:ascii="Times New Roman" w:eastAsia="Times New Roman" w:hAnsi="Times New Roman" w:cs="Times New Roman"/>
-        <w:noProof/>
-        <w:lang w:eastAsia="en-GB"/>
-      </w:rPr>
-      <mc:AlternateContent>
-        <mc:Choice Requires="wps">
-          <w:drawing>
-            <wp:anchor distT="0" distB="0" distL="114300" distR="114300" simplePos="0" relativeHeight="251658239" behindDoc="0" locked="0" layoutInCell="1" allowOverlap="1" wp14:anchorId="394A9A46" wp14:editId="22DCB159">
-              <wp:simplePos x="0" y="0"/>
-              <wp:positionH relativeFrom="column">
-                <wp:posOffset>-514350</wp:posOffset>
-              </wp:positionH>
-              <wp:positionV relativeFrom="paragraph">
-                <wp:posOffset>-252000</wp:posOffset>
-              </wp:positionV>
-              <wp:extent cx="7743549" cy="322053"/>
-              <wp:effectExtent l="0" t="0" r="3810" b="0"/>
-              <wp:wrapNone/>
-              <wp:docPr id="325309492" name="Wave 10"/>
-              <wp:cNvGraphicFramePr/>
-              <a:graphic xmlns:a="http://schemas.openxmlformats.org/drawingml/2006/main">
-                <a:graphicData uri="http://schemas.microsoft.com/office/word/2010/wordprocessingShape">
-                  <wps:wsp>
-                    <wps:cNvSpPr/>
-                    <wps:spPr>
-                      <a:xfrm>
-                        <a:off x="0" y="0"/>
-                        <a:ext cx="7743549" cy="322053"/>
-                      </a:xfrm>
-                      <a:prstGeom prst="wave">
-                        <a:avLst/>
-                      </a:prstGeom>
-                      <a:solidFill>
-                        <a:srgbClr val="001652"/>
-                      </a:solidFill>
-                      <a:ln>
-                        <a:noFill/>
-                      </a:ln>
-                    </wps:spPr>
-                    <wps:style>
-                      <a:lnRef idx="0">
-                        <a:scrgbClr r="0" g="0" b="0"/>
-                      </a:lnRef>
-                      <a:fillRef idx="0">
-                        <a:scrgbClr r="0" g="0" b="0"/>
-                      </a:fillRef>
-                      <a:effectRef idx="0">
-                        <a:scrgbClr r="0" g="0" b="0"/>
-                      </a:effectRef>
-                      <a:fontRef idx="minor">
-                        <a:schemeClr val="dk1"/>
-                      </a:fontRef>
-                    </wps:style>
-                    <wps:bodyPr rot="0" spcFirstLastPara="0" vertOverflow="overflow" horzOverflow="overflow" vert="horz" wrap="square" lIns="91440" tIns="45720" rIns="91440" bIns="45720" numCol="1" spcCol="0" rtlCol="0" fromWordArt="0" anchor="ctr" anchorCtr="0" forceAA="0" compatLnSpc="1">
-                      <a:prstTxWarp prst="textNoShape">
-                        <a:avLst/>
-                      </a:prstTxWarp>
-                      <a:noAutofit/>
-                    </wps:bodyPr>
-                  </wps:wsp>
-                </a:graphicData>
-              </a:graphic>
-              <wp14:sizeRelH relativeFrom="margin">
-                <wp14:pctWidth>0</wp14:pctWidth>
-              </wp14:sizeRelH>
-              <wp14:sizeRelV relativeFrom="margin">
-                <wp14:pctHeight>0</wp14:pctHeight>
-              </wp14:sizeRelV>
-            </wp:anchor>
-          </w:drawing>
-        </mc:Choice>
-        <mc:Fallback xmlns:w16cei="http://schemas.microsoft.com/office/word/2026/wordml/cei">
-          <w:pict>
-            <v:shape w14:anchorId="4B0B4898" id="Wave 10" o:spid="_x0000_s1026" type="#_x0000_t64" style="position:absolute;margin-left:-40.5pt;margin-top:-19.85pt;width:609.75pt;height:25.35pt;z-index:251658239;visibility:visible;mso-wrap-style:square;mso-width-percent:0;mso-height-percent:0;mso-wrap-distance-left:9pt;mso-wrap-distance-top:0;mso-wrap-distance-right:9pt;mso-wrap-distance-bottom:0;mso-position-horizontal:absolute;mso-position-horizontal-relative:text;mso-position-vertical:absolute;mso-position-vertical-relative:text;mso-width-percent:0;mso-height-percent:0;mso-width-relative:margin;mso-height-relative:margin;v-text-anchor:middle" o:gfxdata="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" adj="2700" fillcolor="#001652" stroked="f"/>
-          </w:pict>
-        </mc:Fallback>
-      </mc:AlternateContent>
-    </w:r>
-    <w:r>
-      <w:rPr>
-        <w:rFonts w:ascii="Times New Roman" w:eastAsia="Times New Roman" w:hAnsi="Times New Roman" w:cs="Times New Roman"/>
-        <w:noProof/>
-        <w:lang w:eastAsia="en-GB"/>
-      </w:rPr>
-      <mc:AlternateContent>
-        <mc:Choice Requires="wps">
-          <w:drawing>
-            <wp:anchor distT="0" distB="0" distL="114300" distR="114300" simplePos="0" relativeHeight="251661312" behindDoc="0" locked="0" layoutInCell="1" allowOverlap="1" wp14:anchorId="1435944C" wp14:editId="28669502">
-              <wp:simplePos x="0" y="0"/>
-              <wp:positionH relativeFrom="column">
-                <wp:posOffset>5330825</wp:posOffset>
-              </wp:positionH>
-              <wp:positionV relativeFrom="paragraph">
-                <wp:posOffset>31115</wp:posOffset>
-              </wp:positionV>
-              <wp:extent cx="1897380" cy="1588770"/>
-              <wp:effectExtent l="0" t="0" r="0" b="0"/>
-              <wp:wrapNone/>
-              <wp:docPr id="13" name="Text Box 13"/>
-              <wp:cNvGraphicFramePr/>
-              <a:graphic xmlns:a="http://schemas.openxmlformats.org/drawingml/2006/main">
-                <a:graphicData uri="http://schemas.microsoft.com/office/word/2010/wordprocessingShape">
-                  <wps:wsp>
-                    <wps:cNvSpPr txBox="1"/>
-                    <wps:spPr>
-                      <a:xfrm>
-                        <a:off x="0" y="0"/>
-                        <a:ext cx="1897380" cy="1588770"/>
-                      </a:xfrm>
-                      <a:prstGeom prst="rect">
-                        <a:avLst/>
-                      </a:prstGeom>
-                      <a:noFill/>
-                      <a:ln>
-                        <a:noFill/>
-                      </a:ln>
-                    </wps:spPr>
-                    <wps:style>
-                      <a:lnRef idx="0">
-                        <a:scrgbClr r="0" g="0" b="0"/>
-                      </a:lnRef>
-                      <a:fillRef idx="0">
-                        <a:scrgbClr r="0" g="0" b="0"/>
-                      </a:fillRef>
-                      <a:effectRef idx="0">
-                        <a:scrgbClr r="0" g="0" b="0"/>
-                      </a:effectRef>
-                      <a:fontRef idx="minor">
-                        <a:schemeClr val="dk1"/>
-                      </a:fontRef>
-                    </wps:style>
-                    <wps:txbx>
-                      <w:txbxContent>
-                        <w:p>
-                          <w:r>
-                            <w:fldChar w:fldCharType="begin"/>
-                          </w:r>
-                          <w:r>
-                            <w:instrText xml:space="preserve"> INCLUDEPICTURE "/var/folders/gk/kz743wfx6kg321wgwjx4c1qm0000gn/T/com.microsoft.Word/WebArchiveCopyPasteTempFiles/indianoil_logo.jpg" \* MERGEFORMATINET </w:instrText>
-                          </w:r>
-                          <w:r>
-                            <w:fldChar w:fldCharType="separate"/>
-                          </w:r>
-                          <w:r>
-                            <w:rPr>
-                              <w:noProof/>
-                            </w:rPr>
-                            <w:drawing>
-                              <wp:inline distT="0" distB="0" distL="0" distR="0" wp14:anchorId="342C339D" wp14:editId="1EC4E1E2">
-                                <wp:extent cx="1633658" cy="1396954"/>
-                                <wp:effectExtent l="0" t="0" r="5080" b="635"/>
-                                <wp:docPr id="14" name="Picture 14" descr="Corporate Logos | IndianOil Corporate Logos"/>
-                                <wp:cNvGraphicFramePr>
-                                  <a:graphicFrameLocks xmlns:a="http://schemas.openxmlformats.org/drawingml/2006/main" noChangeAspect="1"/>
-                                </wp:cNvGraphicFramePr>
-                                <a:graphic xmlns:a="http://schemas.openxmlformats.org/drawingml/2006/main">
-                                  <a:graphicData uri="http://schemas.openxmlformats.org/drawingml/2006/picture">
-                                    <pic:pic xmlns:pic="http://schemas.openxmlformats.org/drawingml/2006/picture">
-                                      <pic:nvPicPr>
-                                        <pic:cNvPr id="0" name="Picture 14" descr="Corporate Logos | IndianOil Corporate Logos"/>
-                                        <pic:cNvPicPr>
-                                          <a:picLocks noChangeAspect="1" noChangeArrowheads="1"/>
-                                        </pic:cNvPicPr>
-                                      </pic:nvPicPr>
-                                      <pic:blipFill>
-                                        <a:blip r:embed="rId1">
-                                          <a:extLst>
-                                            <a:ext uri="{28A0092B-C50C-407E-A947-70E740481C1C}">
-                                              <a14:useLocalDpi xmlns:a14="http://schemas.microsoft.com/office/drawing/2010/main" val="0"/>
-                                            </a:ext>
-                                          </a:extLst>
-                                        </a:blip>
-                                        <a:srcRect/>
-                                        <a:stretch>
-                                          <a:fillRect/>
-                                        </a:stretch>
-                                      </pic:blipFill>
-                                      <pic:spPr bwMode="auto">
-                                        <a:xfrm>
-                                          <a:off x="0" y="0"/>
-                                          <a:ext cx="1655008" cy="1415211"/>
-                                        </a:xfrm>
-                                        <a:prstGeom prst="rect">
-                                          <a:avLst/>
-                                        </a:prstGeom>
-                                        <a:noFill/>
-                                        <a:ln>
-                                          <a:noFill/>
-                                        </a:ln>
-                                      </pic:spPr>
-                                    </pic:pic>
-                                  </a:graphicData>
-                                </a:graphic>
-                              </wp:inline>
-                            </w:drawing>
-                          </w:r>
-                          <w:r>
-                            <w:fldChar w:fldCharType="end"/>
-                          </w:r>
-                        </w:p>
-                        <w:p/>
-                      </w:txbxContent>
-                    </wps:txbx>
-                    <wps:bodyPr rot="0" spcFirstLastPara="0" vertOverflow="overflow" horzOverflow="overflow" vert="horz" wrap="square" lIns="91440" tIns="45720" rIns="91440" bIns="45720" numCol="1" spcCol="0" rtlCol="0" fromWordArt="0" anchor="t" anchorCtr="0" forceAA="0" compatLnSpc="1">
-                      <a:prstTxWarp prst="textNoShape">
-                        <a:avLst/>
-                      </a:prstTxWarp>
-                      <a:noAutofit/>
-                    </wps:bodyPr>
-                  </wps:wsp>
-                </a:graphicData>
-              </a:graphic>
-              <wp14:sizeRelH relativeFrom="margin">
-                <wp14:pctWidth>0</wp14:pctWidth>
-              </wp14:sizeRelH>
-              <wp14:sizeRelV relativeFrom="margin">
-                <wp14:pctHeight>0</wp14:pctHeight>
-              </wp14:sizeRelV>
-            </wp:anchor>
-          </w:drawing>
-        </mc:Choice>
-        <mc:Fallback xmlns:w16cei="http://schemas.microsoft.com/office/word/2026/wordml/cei">
-          <w:pict>
-            <v:shapetype w14:anchorId="1435944C" id="_x0000_t202" coordsize="21600,21600" o:spt="202" path="m,l,21600r21600,l21600,xe">
-              <v:stroke joinstyle="miter"/>
-              <v:path gradientshapeok="t" o:connecttype="rect"/>
-            </v:shapetype>
-            <v:shape id="Text Box 13" o:spid="_x0000_s1027" type="#_x0000_t202" style="position:absolute;margin-left:419.75pt;margin-top:2.45pt;width:149.4pt;height:125.1pt;z-index:251661312;visibility:visible;mso-wrap-style:square;mso-width-percent:0;mso-height-percent:0;mso-wrap-distance-left:9pt;mso-wrap-distance-top:0;mso-wrap-distance-right:9pt;mso-wrap-distance-bottom:0;mso-position-horizontal:absolute;mso-position-horizontal-relative:text;mso-position-vertical:absolute;mso-position-vertical-relative:text;mso-width-percent:0;mso-height-percent:0;mso-width-relative:margin;mso-height-relative:margin;v-text-anchor:top" o:gfxdata="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" filled="f" stroked="f">
-              <v:textbox>
-                <w:txbxContent>
-                  <w:p>
-                    <w:r>
-                      <w:fldChar w:fldCharType="begin"/>
-                    </w:r>
-                    <w:r>
-                      <w:instrText xml:space="preserve"> INCLUDEPICTURE "/var/folders/gk/kz743wfx6kg321wgwjx4c1qm0000gn/T/com.microsoft.Word/WebArchiveCopyPasteTempFiles/indianoil_logo.jpg" \* MERGEFORMATINET </w:instrText>
-                    </w:r>
-                    <w:r>
-                      <w:fldChar w:fldCharType="separate"/>
-                    </w:r>
-                    <w:r>
-                      <w:rPr>
-                        <w:noProof/>
-                      </w:rPr>
-                      <w:drawing>
-                        <wp:inline distT="0" distB="0" distL="0" distR="0" wp14:anchorId="342C339D" wp14:editId="1EC4E1E2">
-                          <wp:extent cx="1633658" cy="1396954"/>
-                          <wp:effectExtent l="0" t="0" r="5080" b="635"/>
-                          <wp:docPr id="14" name="Picture 14" descr="Corporate Logos | IndianOil Corporate Logos"/>
-                          <wp:cNvGraphicFramePr>
-                            <a:graphicFrameLocks xmlns:a="http://schemas.openxmlformats.org/drawingml/2006/main" noChangeAspect="1"/>
-                          </wp:cNvGraphicFramePr>
-                          <a:graphic xmlns:a="http://schemas.openxmlformats.org/drawingml/2006/main">
-                            <a:graphicData uri="http://schemas.openxmlformats.org/drawingml/2006/picture">
-                              <pic:pic xmlns:pic="http://schemas.openxmlformats.org/drawingml/2006/picture">
-                                <pic:nvPicPr>
-                                  <pic:cNvPr id="0" name="Picture 14" descr="Corporate Logos | IndianOil Corporate Logos"/>
-                                  <pic:cNvPicPr>
-                                    <a:picLocks noChangeAspect="1" noChangeArrowheads="1"/>
-                                  </pic:cNvPicPr>
-                                </pic:nvPicPr>
-                                <pic:blipFill>
-                                  <a:blip r:embed="rId2">
-                                    <a:extLst>
-                                      <a:ext uri="{28A0092B-C50C-407E-A947-70E740481C1C}">
-                                        <a14:useLocalDpi xmlns:a14="http://schemas.microsoft.com/office/drawing/2010/main" val="0"/>
-                                      </a:ext>
-                                    </a:extLst>
-                                  </a:blip>
-                                  <a:srcRect/>
-                                  <a:stretch>
-                                    <a:fillRect/>
-                                  </a:stretch>
-                                </pic:blipFill>
-                                <pic:spPr bwMode="auto">
-                                  <a:xfrm>
-                                    <a:off x="0" y="0"/>
-                                    <a:ext cx="1655008" cy="1415211"/>
-                                  </a:xfrm>
-                                  <a:prstGeom prst="rect">
-                                    <a:avLst/>
-                                  </a:prstGeom>
-                                  <a:noFill/>
-                                  <a:ln>
-                                    <a:noFill/>
-                                  </a:ln>
-                                </pic:spPr>
-                              </pic:pic>
-                            </a:graphicData>
-                          </a:graphic>
-                        </wp:inline>
-                      </w:drawing>
-                    </w:r>
-                    <w:r>
-                      <w:fldChar w:fldCharType="end"/>
-                    </w:r>
-                  </w:p>
-                  <w:p/>
-                </w:txbxContent>
-              </v:textbox>
-            </v:shape>
-          </w:pict>
-        </mc:Fallback>
-      </mc:AlternateContent>
-    </w:r>
-    <w:r>
-      <w:rPr>
-        <w:noProof/>
-      </w:rPr>
-      <mc:AlternateContent>
-        <mc:Choice Requires="wps">
-          <w:drawing>
-            <wp:anchor distT="0" distB="0" distL="114300" distR="114300" simplePos="0" relativeHeight="251663360" behindDoc="0" locked="0" layoutInCell="1" allowOverlap="1" wp14:anchorId="276E64AD" wp14:editId="378FF2E9">
-              <wp:simplePos x="0" y="0"/>
-              <wp:positionH relativeFrom="column">
-                <wp:posOffset>-684530</wp:posOffset>
-              </wp:positionH>
-              <wp:positionV relativeFrom="paragraph">
-                <wp:posOffset>32914</wp:posOffset>
-              </wp:positionV>
-              <wp:extent cx="1707615" cy="1680248"/>
-              <wp:effectExtent l="0" t="0" r="0" b="0"/>
-              <wp:wrapNone/>
-              <wp:docPr id="246774127" name="Text Box 4"/>
-              <wp:cNvGraphicFramePr/>
-              <a:graphic xmlns:a="http://schemas.openxmlformats.org/drawingml/2006/main">
-                <a:graphicData uri="http://schemas.microsoft.com/office/word/2010/wordprocessingShape">
-                  <wps:wsp>
-                    <wps:cNvSpPr txBox="1"/>
-                    <wps:spPr>
-                      <a:xfrm>
-                        <a:off x="0" y="0"/>
-                        <a:ext cx="1707615" cy="1680248"/>
-                      </a:xfrm>
-                      <a:prstGeom prst="rect">
-                        <a:avLst/>
-                      </a:prstGeom>
-                      <a:noFill/>
-                      <a:ln>
-                        <a:noFill/>
-                      </a:ln>
-                    </wps:spPr>
-                    <wps:style>
-                      <a:lnRef idx="0">
-                        <a:scrgbClr r="0" g="0" b="0"/>
-                      </a:lnRef>
-                      <a:fillRef idx="0">
-                        <a:scrgbClr r="0" g="0" b="0"/>
-                      </a:fillRef>
-                      <a:effectRef idx="0">
-                        <a:scrgbClr r="0" g="0" b="0"/>
-                      </a:effectRef>
-                      <a:fontRef idx="minor">
-                        <a:schemeClr val="dk1"/>
-                      </a:fontRef>
-                    </wps:style>
-                    <wps:txbx>
-                      <w:txbxContent>
-                        <w:p>
-                          <w:r>
-                            <w:fldChar w:fldCharType="begin"/>
-                          </w:r>
-                          <w:r>
-                            <w:instrText xml:space="preserve"> INCLUDEPICTURE "/var/folders/gk/kz743wfx6kg321wgwjx4c1qm0000gn/T/com.microsoft.Word/WebArchiveCopyPasteTempFiles/indianoil_logo.jpg" \* MERGEFORMATINET </w:instrText>
-                          </w:r>
-                          <w:r>
-                            <w:fldChar w:fldCharType="separate"/>
-                          </w:r>
-                          <w:r>
-                            <w:rPr>
-                              <w:noProof/>
-                            </w:rPr>
-                            <w:drawing>
-                              <wp:inline distT="0" distB="0" distL="0" distR="0" wp14:anchorId="3E9CCB53" wp14:editId="2030F3F0">
-                                <wp:extent cx="1639570" cy="1402010"/>
-                                <wp:effectExtent l="0" t="0" r="0" b="0"/>
-                                <wp:docPr id="1426384947" name="Picture 1426384947" descr="Corporate Logos | IndianOil Corporate Logos"/>
-                                <wp:cNvGraphicFramePr>
-                                  <a:graphicFrameLocks xmlns:a="http://schemas.openxmlformats.org/drawingml/2006/main" noChangeAspect="1"/>
-                                </wp:cNvGraphicFramePr>
-                                <a:graphic xmlns:a="http://schemas.openxmlformats.org/drawingml/2006/main">
-                                  <a:graphicData uri="http://schemas.openxmlformats.org/drawingml/2006/picture">
-                                    <pic:pic xmlns:pic="http://schemas.openxmlformats.org/drawingml/2006/picture">
-                                      <pic:nvPicPr>
-                                        <pic:cNvPr id="0" name="Picture 14" descr="Corporate Logos | IndianOil Corporate Logos"/>
-                                        <pic:cNvPicPr>
-                                          <a:picLocks noChangeAspect="1" noChangeArrowheads="1"/>
-                                        </pic:cNvPicPr>
-                                      </pic:nvPicPr>
-                                      <pic:blipFill>
-                                        <a:blip r:embed="rId1">
-                                          <a:clrChange>
-                                            <a:clrFrom>
-                                              <a:srgbClr val="FFFFFF"/>
-                                            </a:clrFrom>
-                                            <a:clrTo>
-                                              <a:srgbClr val="FFFFFF">
-                                                <a:alpha val="0"/>
-                                              </a:srgbClr>
-                                            </a:clrTo>
-                                          </a:clrChange>
-                                          <a:extLst>
-                                            <a:ext uri="{28A0092B-C50C-407E-A947-70E740481C1C}">
-                                              <a14:useLocalDpi xmlns:a14="http://schemas.microsoft.com/office/drawing/2010/main" val="0"/>
-                                            </a:ext>
-                                          </a:extLst>
-                                        </a:blip>
-                                        <a:srcRect/>
-                                        <a:stretch>
-                                          <a:fillRect/>
-                                        </a:stretch>
-                                      </pic:blipFill>
-                                      <pic:spPr bwMode="auto">
-                                        <a:xfrm>
-                                          <a:off x="0" y="0"/>
-                                          <a:ext cx="1660910" cy="1420258"/>
-                                        </a:xfrm>
-                                        <a:prstGeom prst="rect">
-                                          <a:avLst/>
-                                        </a:prstGeom>
-                                        <a:noFill/>
-                                        <a:ln>
-                                          <a:noFill/>
-                                        </a:ln>
-                                      </pic:spPr>
-                                    </pic:pic>
-                                  </a:graphicData>
-                                </a:graphic>
-                              </wp:inline>
-                            </w:drawing>
-                          </w:r>
-                          <w:r>
-                            <w:fldChar w:fldCharType="end"/>
-                          </w:r>
-                        </w:p>
-                      </w:txbxContent>
-                    </wps:txbx>
-                    <wps:bodyPr rot="0" spcFirstLastPara="0" vertOverflow="overflow" horzOverflow="overflow" vert="horz" wrap="square" lIns="91440" tIns="45720" rIns="91440" bIns="45720" numCol="1" spcCol="0" rtlCol="0" fromWordArt="0" anchor="t" anchorCtr="0" forceAA="0" compatLnSpc="1">
-                      <a:prstTxWarp prst="textNoShape">
-                        <a:avLst/>
-                      </a:prstTxWarp>
-                      <a:noAutofit/>
-                    </wps:bodyPr>
-                  </wps:wsp>
-                </a:graphicData>
-              </a:graphic>
-              <wp14:sizeRelH relativeFrom="margin">
-                <wp14:pctWidth>0</wp14:pctWidth>
-              </wp14:sizeRelH>
-              <wp14:sizeRelV relativeFrom="margin">
-                <wp14:pctHeight>0</wp14:pctHeight>
-              </wp14:sizeRelV>
-            </wp:anchor>
-          </w:drawing>
-        </mc:Choice>
-        <mc:Fallback xmlns:w16cei="http://schemas.microsoft.com/office/word/2026/wordml/cei">
-          <w:pict>
-            <v:shape w14:anchorId="276E64AD" id="Text Box 4" o:spid="_x0000_s1028" type="#_x0000_t202" style="position:absolute;margin-left:-53.9pt;margin-top:2.6pt;width:134.45pt;height:132.3pt;z-index:251663360;visibility:visible;mso-wrap-style:square;mso-width-percent:0;mso-height-percent:0;mso-wrap-distance-left:9pt;mso-wrap-distance-top:0;mso-wrap-distance-right:9pt;mso-wrap-distance-bottom:0;mso-position-horizontal:absolute;mso-position-horizontal-relative:text;mso-position-vertical:absolute;mso-position-vertical-relative:text;mso-width-percent:0;mso-height-percent:0;mso-width-relative:margin;mso-height-relative:margin;v-text-anchor:top" o:gfxdata="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" filled="f" stroked="f">
-              <v:textbox>
-                <w:txbxContent>
-                  <w:p>
-                    <w:r>
-                      <w:fldChar w:fldCharType="begin"/>
-                    </w:r>
-                    <w:r>
-                      <w:instrText xml:space="preserve"> INCLUDEPICTURE "/var/folders/gk/kz743wfx6kg321wgwjx4c1qm0000gn/T/com.microsoft.Word/WebArchiveCopyPasteTempFiles/indianoil_logo.jpg" \* MERGEFORMATINET </w:instrText>
-                    </w:r>
-                    <w:r>
-                      <w:fldChar w:fldCharType="separate"/>
-                    </w:r>
-                    <w:r>
-                      <w:rPr>
-                        <w:noProof/>
-                      </w:rPr>
-                      <w:drawing>
-                        <wp:inline distT="0" distB="0" distL="0" distR="0" wp14:anchorId="3E9CCB53" wp14:editId="2030F3F0">
-                          <wp:extent cx="1639570" cy="1402010"/>
-                          <wp:effectExtent l="0" t="0" r="0" b="0"/>
-                          <wp:docPr id="1426384947" name="Picture 1426384947" descr="Corporate Logos | IndianOil Corporate Logos"/>
-                          <wp:cNvGraphicFramePr>
-                            <a:graphicFrameLocks xmlns:a="http://schemas.openxmlformats.org/drawingml/2006/main" noChangeAspect="1"/>
-                          </wp:cNvGraphicFramePr>
-                          <a:graphic xmlns:a="http://schemas.openxmlformats.org/drawingml/2006/main">
-                            <a:graphicData uri="http://schemas.openxmlformats.org/drawingml/2006/picture">
-                              <pic:pic xmlns:pic="http://schemas.openxmlformats.org/drawingml/2006/picture">
-                                <pic:nvPicPr>
-                                  <pic:cNvPr id="0" name="Picture 14" descr="Corporate Logos | IndianOil Corporate Logos"/>
-                                  <pic:cNvPicPr>
-                                    <a:picLocks noChangeAspect="1" noChangeArrowheads="1"/>
-                                  </pic:cNvPicPr>
-                                </pic:nvPicPr>
-                                <pic:blipFill>
-                                  <a:blip r:embed="rId2">
-                                    <a:clrChange>
-                                      <a:clrFrom>
-                                        <a:srgbClr val="FFFFFF"/>
-                                      </a:clrFrom>
-                                      <a:clrTo>
-                                        <a:srgbClr val="FFFFFF">
-                                          <a:alpha val="0"/>
-                                        </a:srgbClr>
-                                      </a:clrTo>
-                                    </a:clrChange>
-                                    <a:extLst>
-                                      <a:ext uri="{28A0092B-C50C-407E-A947-70E740481C1C}">
-                                        <a14:useLocalDpi xmlns:a14="http://schemas.microsoft.com/office/drawing/2010/main" val="0"/>
-                                      </a:ext>
-                                    </a:extLst>
-                                  </a:blip>
-                                  <a:srcRect/>
-                                  <a:stretch>
-                                    <a:fillRect/>
-                                  </a:stretch>
-                                </pic:blipFill>
-                                <pic:spPr bwMode="auto">
-                                  <a:xfrm>
-                                    <a:off x="0" y="0"/>
-                                    <a:ext cx="1660910" cy="1420258"/>
-                                  </a:xfrm>
-                                  <a:prstGeom prst="rect">
-                                    <a:avLst/>
-                                  </a:prstGeom>
-                                  <a:noFill/>
-                                  <a:ln>
-                                    <a:noFill/>
-                                  </a:ln>
-                                </pic:spPr>
-                              </pic:pic>
-                            </a:graphicData>
-                          </a:graphic>
-                        </wp:inline>
-                      </w:drawing>
-                    </w:r>
-                    <w:r>
-                      <w:fldChar w:fldCharType="end"/>
-                    </w:r>
-                  </w:p>
-                </w:txbxContent>
-              </v:textbox>
-            </v:shape>
-          </w:pict>
-        </mc:Fallback>
-      </mc:AlternateContent>
-    </w:r>
-    <w:r>
-      <w:rPr>
-        <w:rFonts w:ascii="Times New Roman" w:eastAsia="Times New Roman" w:hAnsi="Times New Roman" w:cs="Times New Roman"/>
-        <w:noProof/>
-        <w:lang w:eastAsia="en-GB"/>
-      </w:rPr>
-      <mc:AlternateContent>
-        <mc:Choice Requires="wps">
-          <w:drawing>
-            <wp:anchor distT="0" distB="0" distL="114300" distR="114300" simplePos="0" relativeHeight="251659264" behindDoc="0" locked="0" layoutInCell="1" allowOverlap="1" wp14:anchorId="3E68D09A" wp14:editId="5F792BCD">
-              <wp:simplePos x="0" y="0"/>
-              <wp:positionH relativeFrom="column">
-                <wp:posOffset>957580</wp:posOffset>
-              </wp:positionH>
-              <wp:positionV relativeFrom="paragraph">
-                <wp:posOffset>-22727</wp:posOffset>
-              </wp:positionV>
-              <wp:extent cx="4514850" cy="1575171"/>
-              <wp:effectExtent l="0" t="0" r="0" b="0"/>
-              <wp:wrapNone/>
-              <wp:docPr id="3" name="Text Box 3"/>
-              <wp:cNvGraphicFramePr/>
-              <a:graphic xmlns:a="http://schemas.openxmlformats.org/drawingml/2006/main">
-                <a:graphicData uri="http://schemas.microsoft.com/office/word/2010/wordprocessingShape">
-                  <wps:wsp>
-                    <wps:cNvSpPr txBox="1"/>
-                    <wps:spPr>
-                      <a:xfrm>
-                        <a:off x="0" y="0"/>
-                        <a:ext cx="4514850" cy="1575171"/>
-                      </a:xfrm>
-                      <a:prstGeom prst="rect">
-                        <a:avLst/>
-                      </a:prstGeom>
-                      <a:noFill/>
-                      <a:ln w="6350">
-                        <a:noFill/>
-                      </a:ln>
-                    </wps:spPr>
-                    <wps:txbx>
-                      <w:txbxContent>
-                        <w:p>
-                          <w:pPr>
-                            <w:jc w:val="center"/>
-                            <w:rPr>
-                              <w:rFonts w:ascii="Georgia" w:hAnsi="Georgia" w:cs="Arial"/>
-                              <w:b/>
-                              <w:bCs/>
-                              <w:color w:val="ED7D31" w:themeColor="accent2"/>
-                              <w:sz w:val="58"/>
-                              <w:szCs w:val="58"/>
-                            </w:rPr>
-                          </w:pPr>
-                          <w:bookmarkStart w:id="0" w:name="RANGE!B2"/>
-                          <w:r>
-                            <w:rPr>
-                              <w:rFonts w:ascii="Georgia" w:hAnsi="Georgia" w:cs="Arial"/>
-                              <w:b/>
-                              <w:bCs/>
-                              <w:color w:val="ED7D31" w:themeColor="accent2"/>
-                              <w:sz w:val="58"/>
-                              <w:szCs w:val="58"/>
-                            </w:rPr>
-                            <w:t>VRIDDHI FUELS</w:t>
-                          </w:r>
-                          <w:bookmarkEnd w:id="0"/>
-                        </w:p>
-                        <w:p>
-                          <w:pPr>
-                            <w:jc w:val="center"/>
-                            <w:rPr>
-                              <w:color w:val="000000" w:themeColor="text1"/>
-                              <w:sz w:val="28"/>
-                              <w:szCs w:val="28"/>
-                            </w:rPr>
-                          </w:pPr>
-                          <w:r>
-                            <w:rPr>
-                              <w:color w:val="000000" w:themeColor="text1"/>
-                              <w:sz w:val="28"/>
-                              <w:szCs w:val="28"/>
-                            </w:rPr>
-                            <w:t>Dealer: Indian Oil Corporation Limited</w:t>
-                          </w:r>
-                        </w:p>
-                        <w:p>
-                          <w:pPr>
-                            <w:jc w:val="center"/>
-                            <w:rPr>
-                              <w:color w:val="000000" w:themeColor="text1"/>
-                              <w:sz w:val="28"/>
-                              <w:szCs w:val="28"/>
-                            </w:rPr>
-                          </w:pPr>
-                          <w:r>
-                            <w:rPr>
-                              <w:color w:val="000000" w:themeColor="text1"/>
-                              <w:sz w:val="28"/>
-                              <w:szCs w:val="28"/>
-                            </w:rPr>
-                            <w:t xml:space="preserve">At </w:t>
-                          </w:r>
-                          <w:proofErr w:type="spellStart"/>
-                          <w:r>
-                            <w:rPr>
-                              <w:color w:val="000000" w:themeColor="text1"/>
-                              <w:sz w:val="28"/>
-                              <w:szCs w:val="28"/>
-                            </w:rPr>
-                            <w:t>Kherual</w:t>
-                          </w:r>
-                          <w:proofErr w:type="spellEnd"/>
-                          <w:r>
-                            <w:rPr>
-                              <w:color w:val="000000" w:themeColor="text1"/>
-                              <w:sz w:val="28"/>
-                              <w:szCs w:val="28"/>
-                            </w:rPr>
-                            <w:t xml:space="preserve"> Post </w:t>
-                          </w:r>
-                          <w:proofErr w:type="spellStart"/>
-                          <w:r>
-                            <w:rPr>
-                              <w:color w:val="000000" w:themeColor="text1"/>
-                              <w:sz w:val="28"/>
-                              <w:szCs w:val="28"/>
-                            </w:rPr>
-                            <w:t>Badmal</w:t>
-                          </w:r>
-                          <w:proofErr w:type="spellEnd"/>
-                        </w:p>
-                        <w:p>
-                          <w:pPr>
-                            <w:jc w:val="center"/>
-                            <w:rPr>
-                              <w:color w:val="000000" w:themeColor="text1"/>
-                              <w:sz w:val="28"/>
-                              <w:szCs w:val="28"/>
-                            </w:rPr>
-                          </w:pPr>
-                          <w:r>
-                            <w:rPr>
-                              <w:color w:val="000000" w:themeColor="text1"/>
-                              <w:sz w:val="28"/>
-                              <w:szCs w:val="28"/>
-                            </w:rPr>
-                            <w:t>Jharsuguda, ODISHA 768202</w:t>
-                          </w:r>
-                        </w:p>
-                        <w:p>
-                          <w:pPr>
-                            <w:jc w:val="center"/>
-                            <w:rPr>
-                              <w:color w:val="000000" w:themeColor="text1"/>
-                              <w:sz w:val="28"/>
-                              <w:szCs w:val="28"/>
-                            </w:rPr>
-                          </w:pPr>
-                          <w:r>
-                            <w:rPr>
-                              <w:color w:val="000000" w:themeColor="text1"/>
-                              <w:sz w:val="28"/>
-                              <w:szCs w:val="28"/>
-                            </w:rPr>
-                            <w:t xml:space="preserve">Contact </w:t>
-                          </w:r>
-                          <w:r>
-                            <w:rPr>
-                              <w:color w:val="000000" w:themeColor="text1"/>
-                              <w:sz w:val="28"/>
-                              <w:szCs w:val="28"/>
-                            </w:rPr>
-                            <w:t>–</w:t>
-                          </w:r>
-                          <w:r>
-                            <w:rPr>
-                              <w:color w:val="000000" w:themeColor="text1"/>
-                              <w:sz w:val="28"/>
-                              <w:szCs w:val="28"/>
-                            </w:rPr>
-                            <w:t xml:space="preserve"> 9937344411</w:t>
-                          </w:r>
-                          <w:r>
-                            <w:rPr>
-                              <w:color w:val="000000" w:themeColor="text1"/>
-                              <w:sz w:val="28"/>
-                              <w:szCs w:val="28"/>
-                            </w:rPr>
-                            <w:t>, 7008540577</w:t>
-                          </w:r>
-                        </w:p>
-                        <w:p>
-                          <w:pPr>
-                            <w:jc w:val="center"/>
-                            <w:rPr>
-                              <w:b/>
-                              <w:bCs/>
-                              <w:color w:val="C00000"/>
-                              <w:sz w:val="28"/>
-                              <w:szCs w:val="28"/>
-                            </w:rPr>
-                          </w:pPr>
-                          <w:r>
-                            <w:rPr>
-                              <w:b/>
-                              <w:bCs/>
-                              <w:color w:val="C00000"/>
-                              <w:sz w:val="28"/>
-                              <w:szCs w:val="28"/>
-                            </w:rPr>
-                            <w:t>GSTIN – 21AATFV8250A1Z8</w:t>
-                          </w:r>
-                        </w:p>
-                      </w:txbxContent>
-                    </wps:txbx>
-                    <wps:bodyPr rot="0" spcFirstLastPara="0" vertOverflow="overflow" horzOverflow="overflow" vert="horz" wrap="square" lIns="91440" tIns="45720" rIns="91440" bIns="45720" numCol="1" spcCol="0" rtlCol="0" fromWordArt="0" anchor="t" anchorCtr="0" forceAA="0" compatLnSpc="1">
-                      <a:prstTxWarp prst="textNoShape">
-                        <a:avLst/>
-                      </a:prstTxWarp>
-                      <a:noAutofit/>
-                    </wps:bodyPr>
-                  </wps:wsp>
-                </a:graphicData>
-              </a:graphic>
-              <wp14:sizeRelH relativeFrom="margin">
-                <wp14:pctWidth>0</wp14:pctWidth>
-              </wp14:sizeRelH>
-              <wp14:sizeRelV relativeFrom="margin">
-                <wp14:pctHeight>0</wp14:pctHeight>
-              </wp14:sizeRelV>
-            </wp:anchor>
-          </w:drawing>
-        </mc:Choice>
-        <mc:Fallback xmlns:w16cei="http://schemas.microsoft.com/office/word/2026/wordml/cei">
-          <w:pict>
-            <v:shape w14:anchorId="3E68D09A" id="Text Box 3" o:spid="_x0000_s1029" type="#_x0000_t202" style="position:absolute;margin-left:75.4pt;margin-top:-1.8pt;width:355.5pt;height:124.05pt;z-index:251659264;visibility:visible;mso-wrap-style:square;mso-width-percent:0;mso-height-percent:0;mso-wrap-distance-left:9pt;mso-wrap-distance-top:0;mso-wrap-distance-right:9pt;mso-wrap-distance-bottom:0;mso-position-horizontal:absolute;mso-position-horizontal-relative:text;mso-position-vertical:absolute;mso-position-vertical-relative:text;mso-width-percent:0;mso-height-percent:0;mso-width-relative:margin;mso-height-relative:margin;v-text-anchor:top" o:gfxdata="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" filled="f" stroked="f" strokeweight=".5pt">
-              <v:textbox>
-                <w:txbxContent>
-                  <w:p>
-                    <w:pPr>
-                      <w:jc w:val="center"/>
-                      <w:rPr>
-                        <w:rFonts w:ascii="Georgia" w:hAnsi="Georgia" w:cs="Arial"/>
-                        <w:b/>
-                        <w:bCs/>
-                        <w:color w:val="ED7D31" w:themeColor="accent2"/>
-                        <w:sz w:val="58"/>
-                        <w:szCs w:val="58"/>
-                      </w:rPr>
-                    </w:pPr>
-                    <w:bookmarkStart w:id="1" w:name="RANGE!B2"/>
-                    <w:r>
-                      <w:rPr>
-                        <w:rFonts w:ascii="Georgia" w:hAnsi="Georgia" w:cs="Arial"/>
-                        <w:b/>
-                        <w:bCs/>
-                        <w:color w:val="ED7D31" w:themeColor="accent2"/>
-                        <w:sz w:val="58"/>
-                        <w:szCs w:val="58"/>
-                      </w:rPr>
-                      <w:t>VRIDDHI FUELS</w:t>
-                    </w:r>
-                    <w:bookmarkEnd w:id="1"/>
-                  </w:p>
-                  <w:p>
-                    <w:pPr>
-                      <w:jc w:val="center"/>
-                      <w:rPr>
-                        <w:color w:val="000000" w:themeColor="text1"/>
-                        <w:sz w:val="28"/>
-                        <w:szCs w:val="28"/>
-                      </w:rPr>
-                    </w:pPr>
-                    <w:r>
-                      <w:rPr>
-                        <w:color w:val="000000" w:themeColor="text1"/>
-                        <w:sz w:val="28"/>
-                        <w:szCs w:val="28"/>
-                      </w:rPr>
-                      <w:t>Dealer: Indian Oil Corporation Limited</w:t>
-                    </w:r>
-                  </w:p>
-                  <w:p>
-                    <w:pPr>
-                      <w:jc w:val="center"/>
-                      <w:rPr>
-                        <w:color w:val="000000" w:themeColor="text1"/>
-                        <w:sz w:val="28"/>
-                        <w:szCs w:val="28"/>
-                      </w:rPr>
-                    </w:pPr>
-                    <w:r>
-                      <w:rPr>
-                        <w:color w:val="000000" w:themeColor="text1"/>
-                        <w:sz w:val="28"/>
-                        <w:szCs w:val="28"/>
-                      </w:rPr>
-                      <w:t xml:space="preserve">At </w:t>
-                    </w:r>
-                    <w:proofErr w:type="spellStart"/>
-                    <w:r>
-                      <w:rPr>
-                        <w:color w:val="000000" w:themeColor="text1"/>
-                        <w:sz w:val="28"/>
-                        <w:szCs w:val="28"/>
-                      </w:rPr>
-                      <w:t>Kherual</w:t>
-                    </w:r>
-                    <w:proofErr w:type="spellEnd"/>
-                    <w:r>
-                      <w:rPr>
-                        <w:color w:val="000000" w:themeColor="text1"/>
-                        <w:sz w:val="28"/>
-                        <w:szCs w:val="28"/>
-                      </w:rPr>
-                      <w:t xml:space="preserve"> Post </w:t>
-                    </w:r>
-                    <w:proofErr w:type="spellStart"/>
-                    <w:r>
-                      <w:rPr>
-                        <w:color w:val="000000" w:themeColor="text1"/>
-                        <w:sz w:val="28"/>
-                        <w:szCs w:val="28"/>
-                      </w:rPr>
-                      <w:t>Badmal</w:t>
-                    </w:r>
-                    <w:proofErr w:type="spellEnd"/>
-                  </w:p>
-                  <w:p>
-                    <w:pPr>
-                      <w:jc w:val="center"/>
-                      <w:rPr>
-                        <w:color w:val="000000" w:themeColor="text1"/>
-                        <w:sz w:val="28"/>
-                        <w:szCs w:val="28"/>
-                      </w:rPr>
-                    </w:pPr>
-                    <w:r>
-                      <w:rPr>
-                        <w:color w:val="000000" w:themeColor="text1"/>
-                        <w:sz w:val="28"/>
-                        <w:szCs w:val="28"/>
-                      </w:rPr>
-                      <w:t>Jharsuguda, ODISHA 768202</w:t>
-                    </w:r>
-                  </w:p>
-                  <w:p>
-                    <w:pPr>
-                      <w:jc w:val="center"/>
-                      <w:rPr>
-                        <w:color w:val="000000" w:themeColor="text1"/>
-                        <w:sz w:val="28"/>
-                        <w:szCs w:val="28"/>
-                      </w:rPr>
-                    </w:pPr>
-                    <w:r>
-                      <w:rPr>
-                        <w:color w:val="000000" w:themeColor="text1"/>
-                        <w:sz w:val="28"/>
-                        <w:szCs w:val="28"/>
-                      </w:rPr>
-                      <w:t xml:space="preserve">Contact </w:t>
-                    </w:r>
-                    <w:r>
-                      <w:rPr>
-                        <w:color w:val="000000" w:themeColor="text1"/>
-                        <w:sz w:val="28"/>
-                        <w:szCs w:val="28"/>
-                      </w:rPr>
-                      <w:t>–</w:t>
-                    </w:r>
-                    <w:r>
-                      <w:rPr>
-                        <w:color w:val="000000" w:themeColor="text1"/>
-                        <w:sz w:val="28"/>
-                        <w:szCs w:val="28"/>
-                      </w:rPr>
-                      <w:t xml:space="preserve"> 9937344411</w:t>
-                    </w:r>
-                    <w:r>
-                      <w:rPr>
-                        <w:color w:val="000000" w:themeColor="text1"/>
-                        <w:sz w:val="28"/>
-                        <w:szCs w:val="28"/>
-                      </w:rPr>
-                      <w:t>, 7008540577</w:t>
-                    </w:r>
-                  </w:p>
-                  <w:p>
-                    <w:pPr>
-                      <w:jc w:val="center"/>
-                      <w:rPr>
-                        <w:b/>
-                        <w:bCs/>
-                        <w:color w:val="C00000"/>
-                        <w:sz w:val="28"/>
-                        <w:szCs w:val="28"/>
-                      </w:rPr>
-                    </w:pPr>
-                    <w:r>
-                      <w:rPr>
-                        <w:b/>
-                        <w:bCs/>
-                        <w:color w:val="C00000"/>
-                        <w:sz w:val="28"/>
-                        <w:szCs w:val="28"/>
-                      </w:rPr>
-                      <w:t>GSTIN – 21AATFV8250A1Z8</w:t>
-                    </w:r>
-                  </w:p>
-                </w:txbxContent>
-              </v:textbox>
-            </v:shape>
-          </w:pict>
-        </mc:Fallback>
-      </mc:AlternateContent>
-    </w:r>
-    <w:r>
-      <w:rPr>
-        <w:rFonts w:ascii="Times New Roman" w:eastAsia="Times New Roman" w:hAnsi="Times New Roman" w:cs="Times New Roman"/>
-        <w:noProof/>
-        <w:lang w:eastAsia="en-GB"/>
-      </w:rPr>
-      <mc:AlternateContent>
-        <mc:Choice Requires="wps">
-          <w:drawing>
-            <wp:anchor distT="0" distB="0" distL="114300" distR="114300" simplePos="0" relativeHeight="251662336" behindDoc="0" locked="0" layoutInCell="1" allowOverlap="1" wp14:anchorId="465EDA72" wp14:editId="11C153A0">
-              <wp:simplePos x="0" y="0"/>
-              <wp:positionH relativeFrom="column">
-                <wp:posOffset>-455930</wp:posOffset>
-              </wp:positionH>
-              <wp:positionV relativeFrom="paragraph">
-                <wp:posOffset>1484835</wp:posOffset>
-              </wp:positionV>
-              <wp:extent cx="7548806" cy="0"/>
-              <wp:effectExtent l="12700" t="12700" r="8255" b="12700"/>
-              <wp:wrapNone/>
-              <wp:docPr id="1241218610" name="Straight Connector 11"/>
-              <wp:cNvGraphicFramePr/>
-              <a:graphic xmlns:a="http://schemas.openxmlformats.org/drawingml/2006/main">
-                <a:graphicData uri="http://schemas.microsoft.com/office/word/2010/wordprocessingShape">
-                  <wps:wsp>
-                    <wps:cNvCnPr/>
-                    <wps:spPr>
-                      <a:xfrm flipH="1" flipV="1">
-                        <a:off x="0" y="0"/>
-                        <a:ext cx="7548806" cy="0"/>
-                      </a:xfrm>
-                      <a:prstGeom prst="line">
-                        <a:avLst/>
-                      </a:prstGeom>
-                    </wps:spPr>
-                    <wps:style>
-                      <a:lnRef idx="3">
-                        <a:schemeClr val="dk1"/>
-                      </a:lnRef>
-                      <a:fillRef idx="0">
-                        <a:schemeClr val="dk1"/>
-                      </a:fillRef>
-                      <a:effectRef idx="2">
-                        <a:schemeClr val="dk1"/>
-                      </a:effectRef>
-                      <a:fontRef idx="minor">
-                        <a:schemeClr val="tx1"/>
-                      </a:fontRef>
-                    </wps:style>
-                    <wps:bodyPr/>
-                  </wps:wsp>
-                </a:graphicData>
-              </a:graphic>
-              <wp14:sizeRelV relativeFrom="margin">
-                <wp14:pctHeight>0</wp14:pctHeight>
-              </wp14:sizeRelV>
-            </wp:anchor>
-          </w:drawing>
-        </mc:Choice>
-        <mc:Fallback xmlns:w16cei="http://schemas.microsoft.com/office/word/2026/wordml/cei">
-          <w:pict>
-            <v:line w14:anchorId="7559ED4C" id="Straight Connector 11" o:spid="_x0000_s1026" style="position:absolute;flip:x y;z-index:251662336;visibility:visible;mso-wrap-style:square;mso-height-percent:0;mso-wrap-distance-left:9pt;mso-wrap-distance-top:0;mso-wrap-distance-right:9pt;mso-wrap-distance-bottom:0;mso-position-horizontal:absolute;mso-position-horizontal-relative:text;mso-position-vertical:absolute;mso-position-vertical-relative:text;mso-height-percent:0;mso-height-relative:margin" from="-35.9pt,116.9pt" to="558.5pt,116.9pt" o:gfxdata="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" strokecolor="black [3200]" strokeweight="1.5pt">
-              <v:stroke joinstyle="miter"/>
-            </v:line>
-          </w:pict>
-        </mc:Fallback>
-      </mc:AlternateContent>
+      <w:drawing>
+        <wp:inline distT="0" distB="0" distL="0" distR="0">
+          <wp:extent cx="7559675" cy="2020179"/>
+          <wp:effectExtent l="0" t="0" r="0" b="0"/>
+          <wp:docPr id="100" name="Letterhead"/>
+          <wp:cNvGraphicFramePr>
+            <a:graphicFrameLocks noChangeAspect="1"/>
+          </wp:cNvGraphicFramePr>
+          <a:graphic>
+            <a:graphicData uri="http://schemas.openxmlformats.org/drawingml/2006/picture">
+              <pic:pic>
+                <pic:nvPicPr>
+                  <pic:cNvPr id="100" name="Letterhead"/>
+                  <pic:cNvPicPr/>
+                </pic:nvPicPr>
+                <pic:blipFill>
+                  <a:blip r:embed="rIdLH"/>
+                  <a:stretch>
+                    <a:fillRect/>
+                  </a:stretch>
+                </pic:blipFill>
+                <pic:spPr>
+                  <a:xfrm>
+                    <a:off x="0" y="0"/>
+                    <a:ext cx="7559675" cy="2020179"/>
+                  </a:xfrm>
+                  <a:prstGeom prst="rect">
+                    <a:avLst/>
+                  </a:prstGeom>
+                </pic:spPr>
+              </pic:pic>
+            </a:graphicData>
+          </a:graphic>
+        </wp:inline>
+      </w:drawing>
     </w:r>
   </w:p>
 </w:hdr>

</xml_diff>

<commit_message>
Consignment note: move letterhead image into body (robust across browsers)
The letterhead image in the page HEADER rendered fine in Chromium but on some
browsers (Safari) the header didn't grow to fit it, so the tall banner overlapped
and hid the first body lines ("CONSIGNMENT NOTE" + the notification line).

Move the flat letterhead image to the FIRST paragraph of the body instead, and
empty the header. As ordinary body content it flows correctly in every renderer,
with the heading intact right below it. Page top/header margins set to 0 so the
banner still bleeds to the top edge; goods table and tokens unchanged.

Verified under the app's exact docx-preview options + print CSS: full letterhead,
heading present, bordered table, single A4 page. SW cache v9 to pull the update.

Co-Authored-By: Claude Opus 4.8 <noreply@anthropic.com>
Claude-Session: https://claude.ai/code/session_01DudLGc9pCYCSxH8q197T59
</commit_message>
<xml_diff>
--- a/payments/consignment_template.docx
+++ b/payments/consignment_template.docx
@@ -2,6 +2,49 @@
 <file path=word/document.xml><?xml version="1.0" encoding="utf-8"?>
 <w:document xmlns:wpc="http://schemas.microsoft.com/office/word/2010/wordprocessingCanvas" xmlns:cx="http://schemas.microsoft.com/office/drawing/2014/chartex" xmlns:cx1="http://schemas.microsoft.com/office/drawing/2015/9/8/chartex" xmlns:cx2="http://schemas.microsoft.com/office/drawing/2015/10/21/chartex" xmlns:cx3="http://schemas.microsoft.com/office/drawing/2016/5/9/chartex" xmlns:cx4="http://schemas.microsoft.com/office/drawing/2016/5/10/chartex" xmlns:cx5="http://schemas.microsoft.com/office/drawing/2016/5/11/chartex" xmlns:cx6="http://schemas.microsoft.com/office/drawing/2016/5/12/chartex" xmlns:cx7="http://schemas.microsoft.com/office/drawing/2016/5/13/chartex" xmlns:cx8="http://schemas.microsoft.com/office/drawing/2016/5/14/chartex" xmlns:mc="http://schemas.openxmlformats.org/markup-compatibility/2006" xmlns:m="http://schemas.openxmlformats.org/officeDocument/2006/math" xmlns:aink="http://schemas.microsoft.com/office/drawing/2016/ink" xmlns:am3d="http://schemas.microsoft.com/office/drawing/2017/model3d" xmlns:oel="http://schemas.microsoft.com/office/2019/extlst" xmlns:r="http://schemas.openxmlformats.org/officeDocument/2006/relationships" xmlns:wp14="http://schemas.microsoft.com/office/word/2010/wordprocessingDrawing" xmlns:wp="http://schemas.openxmlformats.org/drawingml/2006/wordprocessingDrawing" xmlns:wpg="http://schemas.microsoft.com/office/word/2010/wordprocessingGroup" xmlns:wpi="http://schemas.microsoft.com/office/word/2010/wordprocessingInk" xmlns:wps="http://schemas.microsoft.com/office/word/2010/wordprocessingShape" xmlns:o="urn:schemas-microsoft-com:office:office" xmlns:v="urn:schemas-microsoft-com:vml" xmlns:w10="urn:schemas-microsoft-com:office:word" xmlns:w="http://schemas.openxmlformats.org/wordprocessingml/2006/main" xmlns:w14="http://schemas.microsoft.com/office/word/2010/wordml" xmlns:w15="http://schemas.microsoft.com/office/word/2012/wordml" xmlns:w16cex="http://schemas.microsoft.com/office/word/2018/wordml/cex" xmlns:w16cid="http://schemas.microsoft.com/office/word/2016/wordml/cid" xmlns:w16="http://schemas.microsoft.com/office/word/2018/wordml" xmlns:w16sdtdh="http://schemas.microsoft.com/office/word/2020/wordml/sdtdatahash" xmlns:w16sdtfl="http://schemas.microsoft.com/office/word/2024/wordml/sdtformatlock" xmlns:w16se="http://schemas.microsoft.com/office/word/2015/wordml/symex" xmlns:w16du="http://schemas.microsoft.com/office/word/2023/wordml/word16du" xmlns:wne="http://schemas.microsoft.com/office/word/2006/wordml" mc:Ignorable="w14 w15 w16se w16cid w16 w16cex w16sdtdh w16sdtfl w16du wp14">
   <w:body>
+    <w:p xmlns:a="http://schemas.openxmlformats.org/drawingml/2006/main" xmlns:pic="http://schemas.openxmlformats.org/drawingml/2006/picture">
+      <w:pPr>
+        <w:spacing w:before="0" w:after="60" w:line="240" w:lineRule="auto"/>
+        <w:ind w:left="-737" w:right="-737"/>
+      </w:pPr>
+      <w:r>
+        <w:drawing>
+          <wp:inline distT="0" distB="0" distL="0" distR="0">
+            <wp:extent cx="7559675" cy="2020179"/>
+            <wp:effectExtent l="0" t="0" r="0" b="0"/>
+            <wp:docPr id="100" name="Letterhead"/>
+            <wp:cNvGraphicFramePr>
+              <a:graphicFrameLocks noChangeAspect="1"/>
+            </wp:cNvGraphicFramePr>
+            <a:graphic>
+              <a:graphicData uri="http://schemas.openxmlformats.org/drawingml/2006/picture">
+                <pic:pic>
+                  <pic:nvPicPr>
+                    <pic:cNvPr id="100" name="Letterhead"/>
+                    <pic:cNvPicPr/>
+                  </pic:nvPicPr>
+                  <pic:blipFill>
+                    <a:blip r:embed="rIdLH"/>
+                    <a:stretch>
+                      <a:fillRect/>
+                    </a:stretch>
+                  </pic:blipFill>
+                  <pic:spPr>
+                    <a:xfrm>
+                      <a:off x="0" y="0"/>
+                      <a:ext cx="7559675" cy="2020179"/>
+                    </a:xfrm>
+                    <a:prstGeom prst="rect">
+                      <a:avLst/>
+                    </a:prstGeom>
+                  </pic:spPr>
+                </pic:pic>
+              </a:graphicData>
+            </a:graphic>
+          </wp:inline>
+        </w:drawing>
+      </w:r>
+    </w:p>
     <w:p>
       <w:pPr>
         <w:jc w:val="center"/>
@@ -892,7 +935,7 @@
       <w:headerReference w:type="first" r:id="rId10"/>
       <w:footerReference w:type="first" r:id="rId11"/>
       <w:pgSz w:w="11906" w:h="16838"/>
-      <w:pgMar w:top="720" w:right="720" w:bottom="720" w:left="720" w:header="0" w:footer="227" w:gutter="0"/>
+      <w:pgMar w:top="0" w:right="720" w:bottom="720" w:left="720" w:header="0" w:footer="227" w:gutter="0"/>
       <w:cols w:space="708"/>
       <w:docGrid w:linePitch="360"/>
     </w:sectPr>
@@ -979,49 +1022,11 @@
 </file>
 
 <file path=word/header2.xml><?xml version="1.0" encoding="utf-8"?>
-<w:hdr xmlns:mc="http://schemas.openxmlformats.org/markup-compatibility/2006" xmlns:o="urn:schemas-microsoft-com:office:office" xmlns:r="http://schemas.openxmlformats.org/officeDocument/2006/relationships" xmlns:v="urn:schemas-microsoft-com:vml" xmlns:wp="http://schemas.openxmlformats.org/drawingml/2006/wordprocessingDrawing" xmlns:w10="urn:schemas-microsoft-com:office:word" xmlns:w="http://schemas.openxmlformats.org/wordprocessingml/2006/main" xmlns:a="http://schemas.openxmlformats.org/drawingml/2006/main" xmlns:pic="http://schemas.openxmlformats.org/drawingml/2006/picture">
+<w:hdr xmlns:w="http://schemas.openxmlformats.org/wordprocessingml/2006/main">
   <w:p>
     <w:pPr>
-      <w:spacing w:before="0" w:after="0" w:line="240" w:lineRule="auto"/>
-      <w:ind w:left="-737" w:right="-737"/>
+      <w:spacing w:after="0" w:line="240" w:lineRule="auto"/>
     </w:pPr>
-    <w:r>
-      <w:drawing>
-        <wp:inline distT="0" distB="0" distL="0" distR="0">
-          <wp:extent cx="7559675" cy="2020179"/>
-          <wp:effectExtent l="0" t="0" r="0" b="0"/>
-          <wp:docPr id="100" name="Letterhead"/>
-          <wp:cNvGraphicFramePr>
-            <a:graphicFrameLocks noChangeAspect="1"/>
-          </wp:cNvGraphicFramePr>
-          <a:graphic>
-            <a:graphicData uri="http://schemas.openxmlformats.org/drawingml/2006/picture">
-              <pic:pic>
-                <pic:nvPicPr>
-                  <pic:cNvPr id="100" name="Letterhead"/>
-                  <pic:cNvPicPr/>
-                </pic:nvPicPr>
-                <pic:blipFill>
-                  <a:blip r:embed="rIdLH"/>
-                  <a:stretch>
-                    <a:fillRect/>
-                  </a:stretch>
-                </pic:blipFill>
-                <pic:spPr>
-                  <a:xfrm>
-                    <a:off x="0" y="0"/>
-                    <a:ext cx="7559675" cy="2020179"/>
-                  </a:xfrm>
-                  <a:prstGeom prst="rect">
-                    <a:avLst/>
-                  </a:prstGeom>
-                </pic:spPr>
-              </pic:pic>
-            </a:graphicData>
-          </a:graphic>
-        </wp:inline>
-      </w:drawing>
-    </w:r>
   </w:p>
 </w:hdr>
 </file>

</xml_diff>

<commit_message>
Consignment template: remove trailing blank paragraphs (fix blank 2nd page)
The consignment-note .docx downloaded from the /payments app came out as two
pages, the second blank. Cause: consignment_template.docx ended with two empty
trailing paragraphs after the signature line (the last one sized 16pt), pure
whitespace that overflowed onto a second page. Removed both; the note now fits on
one page. Signature line and everything else unchanged; XSD-validated
(58 -> 56 paragraphs, all checks pass). The app fills this template client-side,
so every future download is fixed.

Co-Authored-By: Claude Opus 4.8 <noreply@anthropic.com>
Claude-Session: https://claude.ai/code/session_01J97qaua8Vz2Ds4Gfyi2Pnv
</commit_message>
<xml_diff>
--- a/payments/consignment_template.docx
+++ b/payments/consignment_template.docx
@@ -911,21 +911,6 @@
         </w:rPr>
         <w:t>Signature of the Authorised Person with Rubber Seal</w:t>
       </w:r>
-    </w:p>
-    <w:p>
-      <w:pPr>
-        <w:rPr>
-          <w:lang w:val="en-US"/>
-        </w:rPr>
-      </w:pPr>
-    </w:p>
-    <w:p>
-      <w:pPr>
-        <w:rPr>
-          <w:sz w:val="32"/>
-          <w:szCs w:val="32"/>
-        </w:rPr>
-      </w:pPr>
     </w:p>
     <w:sectPr>
       <w:headerReference w:type="even" r:id="rId6"/>

</xml_diff>